<commit_message>
feat: hold a block control's edges, and settle temporary and placeholder controls on the first edit
A keystroke's join may not carry blocks into or out of a block-level content control; the join
is refused and the selection stays. A control left holding one empty paragraph is removed whole
under its deletion clause. A `w:temporary` control is lifted on the first edit inside it
(§17.5.2.43) and `w:showingPlcHdr` is dropped (§17.5.2.39), in the body and in every story.
Every carrier of a control now reads its attribute names from one table.
</commit_message>
<xml_diff>
--- a/__fixtures__/content-controls.docx
+++ b/__fixtures__/content-controls.docx
@@ -231,6 +231,39 @@
         <w:p>
           <w:r>
             <w:t xml:space="preserve">The contents of this control may be retyped, while the control itself may not be removed.</w:t>
+          </w:r>
+        </w:p>
+      </w:sdtContent>
+    </w:sdt>
+    <w:p>
+      <w:r>
+        <w:t xml:space="preserve">The two below say what becomes of them once their contents are edited.</w:t>
+      </w:r>
+    </w:p>
+    <w:sdt>
+      <w:sdtPr>
+        <w:id w:val="411"/>
+        <w:temporary/>
+        <w:richText/>
+      </w:sdtPr>
+      <w:sdtContent>
+        <w:p>
+          <w:r>
+            <w:t xml:space="preserve">This control is removed when its contents are modified.</w:t>
+          </w:r>
+        </w:p>
+      </w:sdtContent>
+    </w:sdt>
+    <w:sdt>
+      <w:sdtPr>
+        <w:id w:val="412"/>
+        <w:showingPlcHdr/>
+        <w:richText/>
+      </w:sdtPr>
+      <w:sdtContent>
+        <w:p>
+          <w:r>
+            <w:t xml:space="preserve">Type the clause reference here.</w:t>
           </w:r>
         </w:p>
       </w:sdtContent>

</xml_diff>

<commit_message>
feat: read a content control around a table row onto the row
A `w:sdt` around a `w:tr` used to stand the whole table down to a placeholder. It now rides on
the row the way a wrapped cell's control rides on the cell, so the row's lock, group, temporary
and placeholder facts are honored and the wrapper goes back around the row. A control holding
more than one row, a nested row control, and a wrapped row that only continues a vertical merge
still demote. A copied wrapped row or cell now opens under a fresh `w:id`.
</commit_message>
<xml_diff>
--- a/__fixtures__/content-controls.docx
+++ b/__fixtures__/content-controls.docx
@@ -268,6 +268,134 @@
         </w:p>
       </w:sdtContent>
     </w:sdt>
+    <w:p>
+      <w:r>
+        <w:t xml:space="preserve">A control may also stand around a whole row of a table, as the first row of the table below shows.</w:t>
+      </w:r>
+    </w:p>
+    <w:tbl>
+      <w:tblPr>
+        <w:tblW w:w="0" w:type="auto"/>
+        <w:tblBorders>
+          <w:top w:val="single" w:sz="4" w:space="0" w:color="auto"/>
+          <w:left w:val="single" w:sz="4" w:space="0" w:color="auto"/>
+          <w:bottom w:val="single" w:sz="4" w:space="0" w:color="auto"/>
+          <w:right w:val="single" w:sz="4" w:space="0" w:color="auto"/>
+          <w:insideH w:val="single" w:sz="4" w:space="0" w:color="auto"/>
+          <w:insideV w:val="single" w:sz="4" w:space="0" w:color="auto"/>
+        </w:tblBorders>
+      </w:tblPr>
+      <w:tblGrid>
+        <w:gridCol w:w="4513"/>
+        <w:gridCol w:w="4513"/>
+      </w:tblGrid>
+      <w:sdt>
+        <w:sdtPr>
+          <w:id w:val="413"/>
+          <w:lock w:val="sdtLocked"/>
+          <w:richText/>
+        </w:sdtPr>
+        <w:sdtContent>
+          <w:tr>
+            <w:tc>
+              <w:tcPr>
+                <w:tcW w:w="4513" w:type="dxa"/>
+              </w:tcPr>
+              <w:p>
+                <w:r>
+                  <w:t xml:space="preserve">A row a control stands around</w:t>
+                </w:r>
+              </w:p>
+            </w:tc>
+            <w:tc>
+              <w:tcPr>
+                <w:tcW w:w="4513" w:type="dxa"/>
+              </w:tcPr>
+              <w:p>
+                <w:r>
+                  <w:t xml:space="preserve">whose wrapper may not be removed.</w:t>
+                </w:r>
+              </w:p>
+            </w:tc>
+          </w:tr>
+        </w:sdtContent>
+      </w:sdt>
+      <w:tr>
+        <w:tc>
+          <w:tcPr>
+            <w:tcW w:w="4513" w:type="dxa"/>
+          </w:tcPr>
+          <w:p>
+            <w:r>
+              <w:t xml:space="preserve">A row beside it no control wraps</w:t>
+            </w:r>
+          </w:p>
+        </w:tc>
+        <w:tc>
+          <w:tcPr>
+            <w:tcW w:w="4513" w:type="dxa"/>
+          </w:tcPr>
+          <w:p>
+            <w:r>
+              <w:t xml:space="preserve">which may be edited and deleted.</w:t>
+            </w:r>
+          </w:p>
+        </w:tc>
+      </w:tr>
+    </w:tbl>
+    <w:p>
+      <w:r>
+        <w:t xml:space="preserve">The control in the last table holds two rows, and one row is all a row wrapper can be carried by, so that table is kept whole.</w:t>
+      </w:r>
+    </w:p>
+    <w:tbl>
+      <w:tblPr>
+        <w:tblW w:w="0" w:type="auto"/>
+        <w:tblBorders>
+          <w:top w:val="single" w:sz="4" w:space="0" w:color="auto"/>
+          <w:left w:val="single" w:sz="4" w:space="0" w:color="auto"/>
+          <w:bottom w:val="single" w:sz="4" w:space="0" w:color="auto"/>
+          <w:right w:val="single" w:sz="4" w:space="0" w:color="auto"/>
+          <w:insideH w:val="single" w:sz="4" w:space="0" w:color="auto"/>
+          <w:insideV w:val="single" w:sz="4" w:space="0" w:color="auto"/>
+        </w:tblBorders>
+      </w:tblPr>
+      <w:tblGrid>
+        <w:gridCol w:w="9026"/>
+      </w:tblGrid>
+      <w:sdt>
+        <w:sdtPr>
+          <w:id w:val="414"/>
+          <w:richText/>
+        </w:sdtPr>
+        <w:sdtContent>
+          <w:tr>
+            <w:tc>
+              <w:tcPr>
+                <w:tcW w:w="9026" w:type="dxa"/>
+              </w:tcPr>
+              <w:p>
+                <w:r>
+                  <w:t xml:space="preserve">The first of the two rows this control holds.</w:t>
+                </w:r>
+              </w:p>
+            </w:tc>
+          </w:tr>
+          <w:tr>
+            <w:tc>
+              <w:tcPr>
+                <w:tcW w:w="9026" w:type="dxa"/>
+              </w:tcPr>
+              <w:p>
+                <w:r>
+                  <w:t xml:space="preserve">The second, which is why the table is kept whole.</w:t>
+                </w:r>
+              </w:p>
+            </w:tc>
+          </w:tr>
+        </w:sdtContent>
+      </w:sdt>
+    </w:tbl>
     <w:p>
       <w:r>
         <w:t xml:space="preserve">Nothing here was saved by a word processor; every part is written on purpose.</w:t>

</xml_diff>

<commit_message>
feat: page a block control by its blocks, and read what stands inside one as the body's own
A block-level content control used to be paged as one unbreakable block. It is now measured by
the kinds of the blocks it holds, so a table inside keeps its row cuts, a page break fires where it
stands, and keep-with-next is carried. Sections are keyed by document position, so a section break
written inside a control ends its section after the control; header and footer text, a comment
body's thread key, an empty note, and the paragraph that keeps two tables apart are all read
through a control the way they are read at the body.
</commit_message>
<xml_diff>
--- a/__fixtures__/content-controls.docx
+++ b/__fixtures__/content-controls.docx
@@ -396,6 +396,36 @@
         </w:sdtContent>
       </w:sdt>
     </w:tbl>
+    <w:p>
+      <w:r>
+        <w:t xml:space="preserve">A control may also hold the paragraph a section ends on, and the last paragraph of the control below closes a section.</w:t>
+      </w:r>
+    </w:p>
+    <w:sdt>
+      <w:sdtPr>
+        <w:id w:val="415"/>
+        <w:richText/>
+      </w:sdtPr>
+      <w:sdtContent>
+        <w:p>
+          <w:r>
+            <w:t xml:space="preserve">The first paragraph of this control, which carries no section properties of its own.</w:t>
+          </w:r>
+        </w:p>
+        <w:p>
+          <w:pPr>
+            <w:sectPr>
+              <w:pgSz w:w="11906" w:h="16838" w:orient="portrait"/>
+              <w:pgMar w:top="1134" w:right="1440" w:bottom="851" w:left="1440" w:header="624" w:footer="482" w:gutter="0"/>
+              <w:docGrid w:linePitch="360"/>
+            </w:sectPr>
+          </w:pPr>
+          <w:r>
+            <w:t xml:space="preserve">Its last paragraph carries the section break, on margins no other section of this document is written to.</w:t>
+          </w:r>
+        </w:p>
+      </w:sdtContent>
+    </w:sdt>
     <w:p>
       <w:r>
         <w:t xml:space="preserve">Nothing here was saved by a word processor; every part is written on purpose.</w:t>

</xml_diff>

<commit_message>
feat: hold a block control's edges, and settle temporary and placeholder controls on the first edit (#160)
</commit_message>
<xml_diff>
--- a/__fixtures__/content-controls.docx
+++ b/__fixtures__/content-controls.docx
@@ -231,6 +231,39 @@
         <w:p>
           <w:r>
             <w:t xml:space="preserve">The contents of this control may be retyped, while the control itself may not be removed.</w:t>
+          </w:r>
+        </w:p>
+      </w:sdtContent>
+    </w:sdt>
+    <w:p>
+      <w:r>
+        <w:t xml:space="preserve">The two below say what becomes of them once their contents are edited.</w:t>
+      </w:r>
+    </w:p>
+    <w:sdt>
+      <w:sdtPr>
+        <w:id w:val="411"/>
+        <w:temporary/>
+        <w:richText/>
+      </w:sdtPr>
+      <w:sdtContent>
+        <w:p>
+          <w:r>
+            <w:t xml:space="preserve">This control is removed when its contents are modified.</w:t>
+          </w:r>
+        </w:p>
+      </w:sdtContent>
+    </w:sdt>
+    <w:sdt>
+      <w:sdtPr>
+        <w:id w:val="412"/>
+        <w:showingPlcHdr/>
+        <w:richText/>
+      </w:sdtPr>
+      <w:sdtContent>
+        <w:p>
+          <w:r>
+            <w:t xml:space="preserve">Type the clause reference here.</w:t>
           </w:r>
         </w:p>
       </w:sdtContent>

</xml_diff>

<commit_message>
feat: page a block control by its blocks, and read what stands inside one as the body's own (#162)
</commit_message>
<xml_diff>
--- a/__fixtures__/content-controls.docx
+++ b/__fixtures__/content-controls.docx
@@ -396,6 +396,36 @@
         </w:sdtContent>
       </w:sdt>
     </w:tbl>
+    <w:p>
+      <w:r>
+        <w:t xml:space="preserve">A control may also hold the paragraph a section ends on, and the last paragraph of the control below closes a section.</w:t>
+      </w:r>
+    </w:p>
+    <w:sdt>
+      <w:sdtPr>
+        <w:id w:val="415"/>
+        <w:richText/>
+      </w:sdtPr>
+      <w:sdtContent>
+        <w:p>
+          <w:r>
+            <w:t xml:space="preserve">The first paragraph of this control, which carries no section properties of its own.</w:t>
+          </w:r>
+        </w:p>
+        <w:p>
+          <w:pPr>
+            <w:sectPr>
+              <w:pgSz w:w="11906" w:h="16838" w:orient="portrait"/>
+              <w:pgMar w:top="1134" w:right="1440" w:bottom="851" w:left="1440" w:header="624" w:footer="482" w:gutter="0"/>
+              <w:docGrid w:linePitch="360"/>
+            </w:sectPr>
+          </w:pPr>
+          <w:r>
+            <w:t xml:space="preserve">Its last paragraph carries the section break, on margins no other section of this document is written to.</w:t>
+          </w:r>
+        </w:p>
+      </w:sdtContent>
+    </w:sdt>
     <w:p>
       <w:r>
         <w:t xml:space="preserve">Nothing here was saved by a word processor; every part is written on purpose.</w:t>

</xml_diff>

<commit_message>
feat: read a content control around a table row onto the row (#161)
</commit_message>
<xml_diff>
--- a/__fixtures__/content-controls.docx
+++ b/__fixtures__/content-controls.docx
@@ -268,6 +268,134 @@
         </w:p>
       </w:sdtContent>
     </w:sdt>
+    <w:p>
+      <w:r>
+        <w:t xml:space="preserve">A control may also stand around a whole row of a table, as the first row of the table below shows.</w:t>
+      </w:r>
+    </w:p>
+    <w:tbl>
+      <w:tblPr>
+        <w:tblW w:w="0" w:type="auto"/>
+        <w:tblBorders>
+          <w:top w:val="single" w:sz="4" w:space="0" w:color="auto"/>
+          <w:left w:val="single" w:sz="4" w:space="0" w:color="auto"/>
+          <w:bottom w:val="single" w:sz="4" w:space="0" w:color="auto"/>
+          <w:right w:val="single" w:sz="4" w:space="0" w:color="auto"/>
+          <w:insideH w:val="single" w:sz="4" w:space="0" w:color="auto"/>
+          <w:insideV w:val="single" w:sz="4" w:space="0" w:color="auto"/>
+        </w:tblBorders>
+      </w:tblPr>
+      <w:tblGrid>
+        <w:gridCol w:w="4513"/>
+        <w:gridCol w:w="4513"/>
+      </w:tblGrid>
+      <w:sdt>
+        <w:sdtPr>
+          <w:id w:val="413"/>
+          <w:lock w:val="sdtLocked"/>
+          <w:richText/>
+        </w:sdtPr>
+        <w:sdtContent>
+          <w:tr>
+            <w:tc>
+              <w:tcPr>
+                <w:tcW w:w="4513" w:type="dxa"/>
+              </w:tcPr>
+              <w:p>
+                <w:r>
+                  <w:t xml:space="preserve">A row a control stands around</w:t>
+                </w:r>
+              </w:p>
+            </w:tc>
+            <w:tc>
+              <w:tcPr>
+                <w:tcW w:w="4513" w:type="dxa"/>
+              </w:tcPr>
+              <w:p>
+                <w:r>
+                  <w:t xml:space="preserve">whose wrapper may not be removed.</w:t>
+                </w:r>
+              </w:p>
+            </w:tc>
+          </w:tr>
+        </w:sdtContent>
+      </w:sdt>
+      <w:tr>
+        <w:tc>
+          <w:tcPr>
+            <w:tcW w:w="4513" w:type="dxa"/>
+          </w:tcPr>
+          <w:p>
+            <w:r>
+              <w:t xml:space="preserve">A row beside it no control wraps</w:t>
+            </w:r>
+          </w:p>
+        </w:tc>
+        <w:tc>
+          <w:tcPr>
+            <w:tcW w:w="4513" w:type="dxa"/>
+          </w:tcPr>
+          <w:p>
+            <w:r>
+              <w:t xml:space="preserve">which may be edited and deleted.</w:t>
+            </w:r>
+          </w:p>
+        </w:tc>
+      </w:tr>
+    </w:tbl>
+    <w:p>
+      <w:r>
+        <w:t xml:space="preserve">The control in the last table holds two rows, and one row is all a row wrapper can be carried by, so that table is kept whole.</w:t>
+      </w:r>
+    </w:p>
+    <w:tbl>
+      <w:tblPr>
+        <w:tblW w:w="0" w:type="auto"/>
+        <w:tblBorders>
+          <w:top w:val="single" w:sz="4" w:space="0" w:color="auto"/>
+          <w:left w:val="single" w:sz="4" w:space="0" w:color="auto"/>
+          <w:bottom w:val="single" w:sz="4" w:space="0" w:color="auto"/>
+          <w:right w:val="single" w:sz="4" w:space="0" w:color="auto"/>
+          <w:insideH w:val="single" w:sz="4" w:space="0" w:color="auto"/>
+          <w:insideV w:val="single" w:sz="4" w:space="0" w:color="auto"/>
+        </w:tblBorders>
+      </w:tblPr>
+      <w:tblGrid>
+        <w:gridCol w:w="9026"/>
+      </w:tblGrid>
+      <w:sdt>
+        <w:sdtPr>
+          <w:id w:val="414"/>
+          <w:richText/>
+        </w:sdtPr>
+        <w:sdtContent>
+          <w:tr>
+            <w:tc>
+              <w:tcPr>
+                <w:tcW w:w="9026" w:type="dxa"/>
+              </w:tcPr>
+              <w:p>
+                <w:r>
+                  <w:t xml:space="preserve">The first of the two rows this control holds.</w:t>
+                </w:r>
+              </w:p>
+            </w:tc>
+          </w:tr>
+          <w:tr>
+            <w:tc>
+              <w:tcPr>
+                <w:tcW w:w="9026" w:type="dxa"/>
+              </w:tcPr>
+              <w:p>
+                <w:r>
+                  <w:t xml:space="preserve">The second, which is why the table is kept whole.</w:t>
+                </w:r>
+              </w:p>
+            </w:tc>
+          </w:tr>
+        </w:sdtContent>
+      </w:sdt>
+    </w:tbl>
     <w:p>
       <w:r>
         <w:t xml:space="preserve">Nothing here was saved by a word processor; every part is written on purpose.</w:t>

</xml_diff>

<commit_message>
feat: part a content control where a section ends inside it
A section that ends at a paragraph inside a block-level content control used to take effect at the
control's end, so what the control held after that paragraph stayed on the closing section's paper.
The layout now lays each piece of a block on the paper of the section it stands in: a candidate
whose piece opens a section always cuts, a page carries the index of the section it opens in, and
the header, footer and page-in-section count are read off that index, so the control is drawn
parted where Word parts it while it stays one node.

A continuous section on other paper or margins opens a page as Word does, whether it starts at a
block or inside one. The content controls fixture gains a paragraph after its break so the control
is parted across two sheets.
</commit_message>
<xml_diff>
--- a/__fixtures__/content-controls.docx
+++ b/__fixtures__/content-controls.docx
@@ -398,7 +398,7 @@
     </w:tbl>
     <w:p>
       <w:r>
-        <w:t xml:space="preserve">A control may also hold the paragraph a section ends on, and the last paragraph of the control below closes a section.</w:t>
+        <w:t xml:space="preserve">A control may also hold the paragraph a section ends on, and the control below is parted where its second paragraph closes a section.</w:t>
       </w:r>
     </w:p>
     <w:sdt>
@@ -421,7 +421,12 @@
             </w:sectPr>
           </w:pPr>
           <w:r>
-            <w:t xml:space="preserve">Its last paragraph carries the section break, on margins no other section of this document is written to.</w:t>
+            <w:t xml:space="preserve">Its second paragraph carries the section break, on margins no other section of this document is written to.</w:t>
+          </w:r>
+        </w:p>
+        <w:p>
+          <w:r>
+            <w:t xml:space="preserve">Its third paragraph comes after the break, so it stands on the next section's paper.</w:t>
           </w:r>
         </w:p>
       </w:sdtContent>

</xml_diff>

<commit_message>
feat: part a content control where a section ends inside it (#169)
</commit_message>
<xml_diff>
--- a/__fixtures__/content-controls.docx
+++ b/__fixtures__/content-controls.docx
@@ -398,7 +398,7 @@
     </w:tbl>
     <w:p>
       <w:r>
-        <w:t xml:space="preserve">A control may also hold the paragraph a section ends on, and the last paragraph of the control below closes a section.</w:t>
+        <w:t xml:space="preserve">A control may also hold the paragraph a section ends on, and the control below is parted where its second paragraph closes a section.</w:t>
       </w:r>
     </w:p>
     <w:sdt>
@@ -421,7 +421,12 @@
             </w:sectPr>
           </w:pPr>
           <w:r>
-            <w:t xml:space="preserve">Its last paragraph carries the section break, on margins no other section of this document is written to.</w:t>
+            <w:t xml:space="preserve">Its second paragraph carries the section break, on margins no other section of this document is written to.</w:t>
+          </w:r>
+        </w:p>
+        <w:p>
+          <w:r>
+            <w:t xml:space="preserve">Its third paragraph comes after the break, so it stands on the next section's paper.</w:t>
           </w:r>
         </w:p>
       </w:sdtContent>

</xml_diff>

<commit_message>
feat: draw nothing for a content control a paragraph holds with nothing inside it (DAY-465)
</commit_message>
<xml_diff>
--- a/__fixtures__/content-controls.docx
+++ b/__fixtures__/content-controls.docx
@@ -431,6 +431,51 @@
         </w:p>
       </w:sdtContent>
     </w:sdt>
+    <w:p>
+      <w:r>
+        <w:t xml:space="preserve">A control may also stand inside a paragraph with nothing inside it, and the two between these words do: </w:t>
+      </w:r>
+      <w:sdt>
+        <w:sdtPr>
+          <w:alias w:val="Signing date"/>
+          <w:id w:val="416"/>
+        </w:sdtPr>
+        <w:sdtContent/>
+      </w:sdt>
+      <w:sdt>
+        <w:sdtPr>
+          <w:id w:val="417"/>
+          <w:lock w:val="sdtLocked"/>
+        </w:sdtPr>
+      </w:sdt>
+      <w:r>
+        <w:t xml:space="preserve">so the sentence runs on with no gap where they stand.</w:t>
+      </w:r>
+    </w:p>
+    <w:p>
+      <w:r>
+        <w:t xml:space="preserve">One of them stands inside a control holding text: </w:t>
+      </w:r>
+      <w:sdt>
+        <w:sdtPr>
+          <w:id w:val="418"/>
+        </w:sdtPr>
+        <w:sdtContent>
+          <w:r>
+            <w:t xml:space="preserve">the words the outer control wraps, </w:t>
+          </w:r>
+          <w:sdt>
+            <w:sdtPr>
+              <w:id w:val="419"/>
+            </w:sdtPr>
+            <w:sdtContent/>
+          </w:sdt>
+        </w:sdtContent>
+      </w:sdt>
+      <w:r>
+        <w:t xml:space="preserve">and the clause after it stands outside them both.</w:t>
+      </w:r>
+    </w:p>
     <w:p>
       <w:r>
         <w:t xml:space="preserve">Nothing here was saved by a word processor; every part is written on purpose.</w:t>

</xml_diff>

<commit_message>
feat: draw nothing for a content control a paragraph holds with nothing inside it (#171)
</commit_message>
<xml_diff>
--- a/__fixtures__/content-controls.docx
+++ b/__fixtures__/content-controls.docx
@@ -431,6 +431,51 @@
         </w:p>
       </w:sdtContent>
     </w:sdt>
+    <w:p>
+      <w:r>
+        <w:t xml:space="preserve">A control may also stand inside a paragraph with nothing inside it, and the two between these words do: </w:t>
+      </w:r>
+      <w:sdt>
+        <w:sdtPr>
+          <w:alias w:val="Signing date"/>
+          <w:id w:val="416"/>
+        </w:sdtPr>
+        <w:sdtContent/>
+      </w:sdt>
+      <w:sdt>
+        <w:sdtPr>
+          <w:id w:val="417"/>
+          <w:lock w:val="sdtLocked"/>
+        </w:sdtPr>
+      </w:sdt>
+      <w:r>
+        <w:t xml:space="preserve">so the sentence runs on with no gap where they stand.</w:t>
+      </w:r>
+    </w:p>
+    <w:p>
+      <w:r>
+        <w:t xml:space="preserve">One of them stands inside a control holding text: </w:t>
+      </w:r>
+      <w:sdt>
+        <w:sdtPr>
+          <w:id w:val="418"/>
+        </w:sdtPr>
+        <w:sdtContent>
+          <w:r>
+            <w:t xml:space="preserve">the words the outer control wraps, </w:t>
+          </w:r>
+          <w:sdt>
+            <w:sdtPr>
+              <w:id w:val="419"/>
+            </w:sdtPr>
+            <w:sdtContent/>
+          </w:sdt>
+        </w:sdtContent>
+      </w:sdt>
+      <w:r>
+        <w:t xml:space="preserve">and the clause after it stands outside them both.</w:t>
+      </w:r>
+    </w:p>
     <w:p>
       <w:r>
         <w:t xml:space="preserve">Nothing here was saved by a word processor; every part is written on purpose.</w:t>

</xml_diff>

<commit_message>
fix: show and fill a highlighted run that holds no text
A run with formatting and no characters, such as the yellow empty cell a
server leaves in a form table, was read as invisible raw XML: its highlight
never showed and text typed there came out unformatted. It is now an
`emptyRun` node wearing its run formatting, drawn as a short box when its
own properties paint, and filled by typed, composed, or pasted text that
takes its formatting. An unfilled blank is written back byte for byte.

Typed text now takes its formatting from the nearest drawn text in the
paragraph, passing over markers that draw nothing, as Word does.

Refs DAY-1945
</commit_message>
<xml_diff>
--- a/__fixtures__/content-controls.docx
+++ b/__fixtures__/content-controls.docx
@@ -476,6 +476,67 @@
         <w:t xml:space="preserve">and the clause after it stands outside them both.</w:t>
       </w:r>
     </w:p>
+    <w:p>
+      <w:r>
+        <w:t xml:space="preserve">A control may hold nothing but a highlighted run with no text in it, a blank left to fill in: </w:t>
+      </w:r>
+      <w:sdt>
+        <w:sdtPr>
+          <w:alias w:val="Signer"/>
+          <w:id w:val="420"/>
+        </w:sdtPr>
+        <w:sdtContent>
+          <w:r>
+            <w:rPr>
+              <w:highlight w:val="yellow"/>
+            </w:rPr>
+            <w:t xml:space="preserve"/>
+          </w:r>
+        </w:sdtContent>
+      </w:sdt>
+    </w:p>
+    <w:tbl>
+      <w:tblPr>
+        <w:tblW w:w="0" w:type="auto"/>
+        <w:tblBorders>
+          <w:top w:val="single" w:sz="4" w:space="0" w:color="auto"/>
+          <w:left w:val="single" w:sz="4" w:space="0" w:color="auto"/>
+          <w:bottom w:val="single" w:sz="4" w:space="0" w:color="auto"/>
+          <w:right w:val="single" w:sz="4" w:space="0" w:color="auto"/>
+          <w:insideH w:val="single" w:sz="4" w:space="0" w:color="auto"/>
+          <w:insideV w:val="single" w:sz="4" w:space="0" w:color="auto"/>
+        </w:tblBorders>
+      </w:tblPr>
+      <w:tblGrid>
+        <w:gridCol w:w="4513"/>
+        <w:gridCol w:w="4513"/>
+      </w:tblGrid>
+      <w:tr>
+        <w:tc>
+          <w:tcPr>
+            <w:tcW w:w="4513" w:type="dxa"/>
+          </w:tcPr>
+          <w:p>
+            <w:r>
+              <w:t xml:space="preserve">A cell holding the same blank</w:t>
+            </w:r>
+          </w:p>
+        </w:tc>
+        <w:tc>
+          <w:tcPr>
+            <w:tcW w:w="4513" w:type="dxa"/>
+          </w:tcPr>
+          <w:p>
+            <w:r>
+              <w:rPr>
+                <w:highlight w:val="yellow"/>
+              </w:rPr>
+              <w:t xml:space="preserve"/>
+            </w:r>
+          </w:p>
+        </w:tc>
+      </w:tr>
+    </w:tbl>
     <w:p>
       <w:r>
         <w:t xml:space="preserve">Nothing here was saved by a word processor; every part is written on purpose.</w:t>

</xml_diff>

<commit_message>
fix: show and fill a highlighted run that holds no text (#209)
</commit_message>
<xml_diff>
--- a/__fixtures__/content-controls.docx
+++ b/__fixtures__/content-controls.docx
@@ -476,6 +476,67 @@
         <w:t xml:space="preserve">and the clause after it stands outside them both.</w:t>
       </w:r>
     </w:p>
+    <w:p>
+      <w:r>
+        <w:t xml:space="preserve">A control may hold nothing but a highlighted run with no text in it, a blank left to fill in: </w:t>
+      </w:r>
+      <w:sdt>
+        <w:sdtPr>
+          <w:alias w:val="Signer"/>
+          <w:id w:val="420"/>
+        </w:sdtPr>
+        <w:sdtContent>
+          <w:r>
+            <w:rPr>
+              <w:highlight w:val="yellow"/>
+            </w:rPr>
+            <w:t xml:space="preserve"/>
+          </w:r>
+        </w:sdtContent>
+      </w:sdt>
+    </w:p>
+    <w:tbl>
+      <w:tblPr>
+        <w:tblW w:w="0" w:type="auto"/>
+        <w:tblBorders>
+          <w:top w:val="single" w:sz="4" w:space="0" w:color="auto"/>
+          <w:left w:val="single" w:sz="4" w:space="0" w:color="auto"/>
+          <w:bottom w:val="single" w:sz="4" w:space="0" w:color="auto"/>
+          <w:right w:val="single" w:sz="4" w:space="0" w:color="auto"/>
+          <w:insideH w:val="single" w:sz="4" w:space="0" w:color="auto"/>
+          <w:insideV w:val="single" w:sz="4" w:space="0" w:color="auto"/>
+        </w:tblBorders>
+      </w:tblPr>
+      <w:tblGrid>
+        <w:gridCol w:w="4513"/>
+        <w:gridCol w:w="4513"/>
+      </w:tblGrid>
+      <w:tr>
+        <w:tc>
+          <w:tcPr>
+            <w:tcW w:w="4513" w:type="dxa"/>
+          </w:tcPr>
+          <w:p>
+            <w:r>
+              <w:t xml:space="preserve">A cell holding the same blank</w:t>
+            </w:r>
+          </w:p>
+        </w:tc>
+        <w:tc>
+          <w:tcPr>
+            <w:tcW w:w="4513" w:type="dxa"/>
+          </w:tcPr>
+          <w:p>
+            <w:r>
+              <w:rPr>
+                <w:highlight w:val="yellow"/>
+              </w:rPr>
+              <w:t xml:space="preserve"/>
+            </w:r>
+          </w:p>
+        </w:tc>
+      </w:tr>
+    </w:tbl>
     <w:p>
       <w:r>
         <w:t xml:space="preserve">Nothing here was saved by a word processor; every part is written on purpose.</w:t>

</xml_diff>